<commit_message>
Add book_drach SQL dump and add/update docs
Add a MySQL dump (book_Drach_LAB_9_backup.sql) with schema and seed data for books, catalogs, orders, and users. Add multiple .docx lab/AI documents and update an existing .docx; remove a temporary ~WRL0003.tmp file. These changes add project lab materials and a database backup for Lab 9.
</commit_message>
<xml_diff>
--- a/Бази даних/Драч_ЛР№7_Звіт.docx
+++ b/Бази даних/Драч_ЛР№7_Звіт.docx
@@ -69,13 +69,23 @@
         </w:rPr>
         <w:t xml:space="preserve"> </w:t>
       </w:r>
-      <w:r>
-        <w:rPr>
-          <w:sz w:val="28"/>
-          <w:szCs w:val="28"/>
-          <w:lang w:val="uk-UA"/>
-        </w:rPr>
-        <w:t>MySQL.</w:t>
+      <w:proofErr w:type="spellStart"/>
+      <w:r>
+        <w:rPr>
+          <w:sz w:val="28"/>
+          <w:szCs w:val="28"/>
+          <w:lang w:val="uk-UA"/>
+        </w:rPr>
+        <w:t>MySQL</w:t>
+      </w:r>
+      <w:proofErr w:type="spellEnd"/>
+      <w:r>
+        <w:rPr>
+          <w:sz w:val="28"/>
+          <w:szCs w:val="28"/>
+          <w:lang w:val="uk-UA"/>
+        </w:rPr>
+        <w:t>.</w:t>
       </w:r>
     </w:p>
     <w:p>
@@ -119,7 +129,25 @@
           <w:szCs w:val="28"/>
           <w:lang w:val="uk-UA"/>
         </w:rPr>
-        <w:t>середовищі MySQL.</w:t>
+        <w:t xml:space="preserve">середовищі </w:t>
+      </w:r>
+      <w:proofErr w:type="spellStart"/>
+      <w:r>
+        <w:rPr>
+          <w:sz w:val="28"/>
+          <w:szCs w:val="28"/>
+          <w:lang w:val="uk-UA"/>
+        </w:rPr>
+        <w:t>MySQL</w:t>
+      </w:r>
+      <w:proofErr w:type="spellEnd"/>
+      <w:r>
+        <w:rPr>
+          <w:sz w:val="28"/>
+          <w:szCs w:val="28"/>
+          <w:lang w:val="uk-UA"/>
+        </w:rPr>
+        <w:t>.</w:t>
       </w:r>
     </w:p>
     <w:p>
@@ -175,7 +203,25 @@
           <w:szCs w:val="28"/>
           <w:lang w:val="uk-UA"/>
         </w:rPr>
-        <w:t xml:space="preserve"> ОС Windows, MySQL.</w:t>
+        <w:t xml:space="preserve"> ОС Windows, </w:t>
+      </w:r>
+      <w:proofErr w:type="spellStart"/>
+      <w:r>
+        <w:rPr>
+          <w:sz w:val="28"/>
+          <w:szCs w:val="28"/>
+          <w:lang w:val="uk-UA"/>
+        </w:rPr>
+        <w:t>MySQL</w:t>
+      </w:r>
+      <w:proofErr w:type="spellEnd"/>
+      <w:r>
+        <w:rPr>
+          <w:sz w:val="28"/>
+          <w:szCs w:val="28"/>
+          <w:lang w:val="uk-UA"/>
+        </w:rPr>
+        <w:t>.</w:t>
       </w:r>
     </w:p>
     <w:p>
@@ -297,7 +343,25 @@
           <w:szCs w:val="28"/>
           <w:lang w:val="uk-UA"/>
         </w:rPr>
-        <w:t xml:space="preserve"> сервер MySQL.</w:t>
+        <w:t xml:space="preserve"> сервер </w:t>
+      </w:r>
+      <w:proofErr w:type="spellStart"/>
+      <w:r>
+        <w:rPr>
+          <w:sz w:val="28"/>
+          <w:szCs w:val="28"/>
+          <w:lang w:val="uk-UA"/>
+        </w:rPr>
+        <w:t>MySQL</w:t>
+      </w:r>
+      <w:proofErr w:type="spellEnd"/>
+      <w:r>
+        <w:rPr>
+          <w:sz w:val="28"/>
+          <w:szCs w:val="28"/>
+          <w:lang w:val="uk-UA"/>
+        </w:rPr>
+        <w:t>.</w:t>
       </w:r>
     </w:p>
     <w:p>
@@ -451,7 +515,25 @@
           <w:szCs w:val="28"/>
           <w:lang w:val="uk-UA"/>
         </w:rPr>
-        <w:t>Запит 1. Вивести на екран всі поля з таблиці catalogs.</w:t>
+        <w:t xml:space="preserve">Запит 1. Вивести на екран всі поля з таблиці </w:t>
+      </w:r>
+      <w:proofErr w:type="spellStart"/>
+      <w:r>
+        <w:rPr>
+          <w:sz w:val="28"/>
+          <w:szCs w:val="28"/>
+          <w:lang w:val="uk-UA"/>
+        </w:rPr>
+        <w:t>catalogs</w:t>
+      </w:r>
+      <w:proofErr w:type="spellEnd"/>
+      <w:r>
+        <w:rPr>
+          <w:sz w:val="28"/>
+          <w:szCs w:val="28"/>
+          <w:lang w:val="uk-UA"/>
+        </w:rPr>
+        <w:t>.</w:t>
       </w:r>
     </w:p>
     <w:p>
@@ -520,7 +602,25 @@
           <w:lang w:val="uk-UA"/>
         </w:rPr>
         <w:lastRenderedPageBreak/>
-        <w:t>Запит 2. Змінити порядок виведення полів з таблиці catalogs.</w:t>
+        <w:t xml:space="preserve">Запит 2. Змінити порядок виведення полів з таблиці </w:t>
+      </w:r>
+      <w:proofErr w:type="spellStart"/>
+      <w:r>
+        <w:rPr>
+          <w:sz w:val="28"/>
+          <w:szCs w:val="28"/>
+          <w:lang w:val="uk-UA"/>
+        </w:rPr>
+        <w:t>catalogs</w:t>
+      </w:r>
+      <w:proofErr w:type="spellEnd"/>
+      <w:r>
+        <w:rPr>
+          <w:sz w:val="28"/>
+          <w:szCs w:val="28"/>
+          <w:lang w:val="uk-UA"/>
+        </w:rPr>
+        <w:t>.</w:t>
       </w:r>
     </w:p>
     <w:p>
@@ -588,7 +688,25 @@
           <w:szCs w:val="28"/>
           <w:lang w:val="uk-UA"/>
         </w:rPr>
-        <w:t>Запит 3. Вивести на екран з таблиці users номер та прізвище покупців зі статусом</w:t>
+        <w:t xml:space="preserve">Запит 3. Вивести на екран з таблиці </w:t>
+      </w:r>
+      <w:proofErr w:type="spellStart"/>
+      <w:r>
+        <w:rPr>
+          <w:sz w:val="28"/>
+          <w:szCs w:val="28"/>
+          <w:lang w:val="uk-UA"/>
+        </w:rPr>
+        <w:t>users</w:t>
+      </w:r>
+      <w:proofErr w:type="spellEnd"/>
+      <w:r>
+        <w:rPr>
+          <w:sz w:val="28"/>
+          <w:szCs w:val="28"/>
+          <w:lang w:val="uk-UA"/>
+        </w:rPr>
+        <w:t xml:space="preserve"> номер та прізвище покупців зі статусом</w:t>
       </w:r>
       <w:r>
         <w:rPr>
@@ -598,13 +716,23 @@
         </w:rPr>
         <w:t xml:space="preserve"> </w:t>
       </w:r>
-      <w:r>
-        <w:rPr>
-          <w:sz w:val="28"/>
-          <w:szCs w:val="28"/>
-          <w:lang w:val="uk-UA"/>
-        </w:rPr>
-        <w:t>active.</w:t>
+      <w:proofErr w:type="spellStart"/>
+      <w:r>
+        <w:rPr>
+          <w:sz w:val="28"/>
+          <w:szCs w:val="28"/>
+          <w:lang w:val="uk-UA"/>
+        </w:rPr>
+        <w:t>active</w:t>
+      </w:r>
+      <w:proofErr w:type="spellEnd"/>
+      <w:r>
+        <w:rPr>
+          <w:sz w:val="28"/>
+          <w:szCs w:val="28"/>
+          <w:lang w:val="uk-UA"/>
+        </w:rPr>
+        <w:t>.</w:t>
       </w:r>
     </w:p>
     <w:p>
@@ -672,7 +800,25 @@
           <w:szCs w:val="28"/>
           <w:lang w:val="uk-UA"/>
         </w:rPr>
-        <w:t>Запит 4. Вивести на екран з таблиці users статус покупців без повторень.</w:t>
+        <w:t xml:space="preserve">Запит 4. Вивести на екран з таблиці </w:t>
+      </w:r>
+      <w:proofErr w:type="spellStart"/>
+      <w:r>
+        <w:rPr>
+          <w:sz w:val="28"/>
+          <w:szCs w:val="28"/>
+          <w:lang w:val="uk-UA"/>
+        </w:rPr>
+        <w:t>users</w:t>
+      </w:r>
+      <w:proofErr w:type="spellEnd"/>
+      <w:r>
+        <w:rPr>
+          <w:sz w:val="28"/>
+          <w:szCs w:val="28"/>
+          <w:lang w:val="uk-UA"/>
+        </w:rPr>
+        <w:t xml:space="preserve"> статус покупців без повторень.</w:t>
       </w:r>
     </w:p>
     <w:p>
@@ -740,7 +886,25 @@
           <w:szCs w:val="28"/>
           <w:lang w:val="uk-UA"/>
         </w:rPr>
-        <w:t>Запит 5. Вивести на екран кількість рядків з таблиці books в яких значення стовпця</w:t>
+        <w:t xml:space="preserve">Запит 5. Вивести на екран кількість рядків з таблиці </w:t>
+      </w:r>
+      <w:proofErr w:type="spellStart"/>
+      <w:r>
+        <w:rPr>
+          <w:sz w:val="28"/>
+          <w:szCs w:val="28"/>
+          <w:lang w:val="uk-UA"/>
+        </w:rPr>
+        <w:t>books</w:t>
+      </w:r>
+      <w:proofErr w:type="spellEnd"/>
+      <w:r>
+        <w:rPr>
+          <w:sz w:val="28"/>
+          <w:szCs w:val="28"/>
+          <w:lang w:val="uk-UA"/>
+        </w:rPr>
+        <w:t xml:space="preserve"> в яких значення стовпця</w:t>
       </w:r>
       <w:r>
         <w:rPr>
@@ -842,25 +1006,89 @@
           <w:lang w:val="uk-UA"/>
         </w:rPr>
         <w:lastRenderedPageBreak/>
-        <w:t>Запит 6. Вивести на екран кількість унікальних значень b_cat_ID в таблиці books</w:t>
-      </w:r>
-    </w:p>
-    <w:p>
-      <w:pPr>
-        <w:spacing w:after="0"/>
-        <w:rPr>
-          <w:sz w:val="28"/>
-          <w:szCs w:val="28"/>
-          <w:lang w:val="uk-UA"/>
-        </w:rPr>
-      </w:pPr>
-      <w:r>
-        <w:rPr>
-          <w:sz w:val="28"/>
-          <w:szCs w:val="28"/>
-          <w:lang w:val="uk-UA"/>
-        </w:rPr>
-        <w:t>(використовувати ключове слова distinct з функцією count ()). Присвоїти новому</w:t>
+        <w:t xml:space="preserve">Запит 6. Вивести на екран кількість унікальних значень </w:t>
+      </w:r>
+      <w:proofErr w:type="spellStart"/>
+      <w:r>
+        <w:rPr>
+          <w:sz w:val="28"/>
+          <w:szCs w:val="28"/>
+          <w:lang w:val="uk-UA"/>
+        </w:rPr>
+        <w:t>b_cat_ID</w:t>
+      </w:r>
+      <w:proofErr w:type="spellEnd"/>
+      <w:r>
+        <w:rPr>
+          <w:sz w:val="28"/>
+          <w:szCs w:val="28"/>
+          <w:lang w:val="uk-UA"/>
+        </w:rPr>
+        <w:t xml:space="preserve"> в таблиці </w:t>
+      </w:r>
+      <w:proofErr w:type="spellStart"/>
+      <w:r>
+        <w:rPr>
+          <w:sz w:val="28"/>
+          <w:szCs w:val="28"/>
+          <w:lang w:val="uk-UA"/>
+        </w:rPr>
+        <w:t>books</w:t>
+      </w:r>
+      <w:proofErr w:type="spellEnd"/>
+    </w:p>
+    <w:p>
+      <w:pPr>
+        <w:spacing w:after="0"/>
+        <w:rPr>
+          <w:sz w:val="28"/>
+          <w:szCs w:val="28"/>
+          <w:lang w:val="uk-UA"/>
+        </w:rPr>
+      </w:pPr>
+      <w:r>
+        <w:rPr>
+          <w:sz w:val="28"/>
+          <w:szCs w:val="28"/>
+          <w:lang w:val="uk-UA"/>
+        </w:rPr>
+        <w:t xml:space="preserve">(використовувати ключове слова </w:t>
+      </w:r>
+      <w:proofErr w:type="spellStart"/>
+      <w:r>
+        <w:rPr>
+          <w:sz w:val="28"/>
+          <w:szCs w:val="28"/>
+          <w:lang w:val="uk-UA"/>
+        </w:rPr>
+        <w:t>distinct</w:t>
+      </w:r>
+      <w:proofErr w:type="spellEnd"/>
+      <w:r>
+        <w:rPr>
+          <w:sz w:val="28"/>
+          <w:szCs w:val="28"/>
+          <w:lang w:val="uk-UA"/>
+        </w:rPr>
+        <w:t xml:space="preserve"> з функцією </w:t>
+      </w:r>
+      <w:proofErr w:type="spellStart"/>
+      <w:r>
+        <w:rPr>
+          <w:sz w:val="28"/>
+          <w:szCs w:val="28"/>
+          <w:lang w:val="uk-UA"/>
+        </w:rPr>
+        <w:t>count</w:t>
+      </w:r>
+      <w:proofErr w:type="spellEnd"/>
+      <w:r>
+        <w:rPr>
+          <w:sz w:val="28"/>
+          <w:szCs w:val="28"/>
+          <w:lang w:val="uk-UA"/>
+        </w:rPr>
+        <w:t xml:space="preserve"> ()). Присвоїти новому</w:t>
       </w:r>
     </w:p>
     <w:p>
@@ -956,25 +1184,61 @@
           <w:szCs w:val="28"/>
           <w:lang w:val="uk-UA"/>
         </w:rPr>
-        <w:t>Запит 7. Вивести на екран з таблиці users покупців жінок</w:t>
-      </w:r>
-    </w:p>
-    <w:p>
-      <w:pPr>
-        <w:spacing w:after="0"/>
-        <w:rPr>
-          <w:sz w:val="28"/>
-          <w:szCs w:val="28"/>
-          <w:lang w:val="uk-UA"/>
-        </w:rPr>
-      </w:pPr>
-      <w:r>
-        <w:rPr>
-          <w:sz w:val="28"/>
-          <w:szCs w:val="28"/>
-          <w:lang w:val="uk-UA"/>
-        </w:rPr>
-        <w:t>Додав генедер до користувачів:</w:t>
+        <w:t xml:space="preserve">Запит 7. Вивести на екран з таблиці </w:t>
+      </w:r>
+      <w:proofErr w:type="spellStart"/>
+      <w:r>
+        <w:rPr>
+          <w:sz w:val="28"/>
+          <w:szCs w:val="28"/>
+          <w:lang w:val="uk-UA"/>
+        </w:rPr>
+        <w:t>users</w:t>
+      </w:r>
+      <w:proofErr w:type="spellEnd"/>
+      <w:r>
+        <w:rPr>
+          <w:sz w:val="28"/>
+          <w:szCs w:val="28"/>
+          <w:lang w:val="uk-UA"/>
+        </w:rPr>
+        <w:t xml:space="preserve"> покупців жінок</w:t>
+      </w:r>
+    </w:p>
+    <w:p>
+      <w:pPr>
+        <w:spacing w:after="0"/>
+        <w:rPr>
+          <w:sz w:val="28"/>
+          <w:szCs w:val="28"/>
+          <w:lang w:val="uk-UA"/>
+        </w:rPr>
+      </w:pPr>
+      <w:r>
+        <w:rPr>
+          <w:sz w:val="28"/>
+          <w:szCs w:val="28"/>
+          <w:lang w:val="uk-UA"/>
+        </w:rPr>
+        <w:t xml:space="preserve">Додав </w:t>
+      </w:r>
+      <w:proofErr w:type="spellStart"/>
+      <w:r>
+        <w:rPr>
+          <w:sz w:val="28"/>
+          <w:szCs w:val="28"/>
+          <w:lang w:val="uk-UA"/>
+        </w:rPr>
+        <w:t>генедер</w:t>
+      </w:r>
+      <w:proofErr w:type="spellEnd"/>
+      <w:r>
+        <w:rPr>
+          <w:sz w:val="28"/>
+          <w:szCs w:val="28"/>
+          <w:lang w:val="uk-UA"/>
+        </w:rPr>
+        <w:t xml:space="preserve"> до користувачів:</w:t>
       </w:r>
     </w:p>
     <w:p>
@@ -1081,125 +1345,6 @@
         <w:rPr>
           <w:sz w:val="28"/>
           <w:szCs w:val="28"/>
-          <w:lang w:val="uk-UA"/>
-        </w:rPr>
-      </w:pPr>
-    </w:p>
-    <w:p>
-      <w:pPr>
-        <w:spacing w:after="0"/>
-        <w:rPr>
-          <w:b/>
-          <w:bCs/>
-          <w:sz w:val="28"/>
-          <w:szCs w:val="28"/>
-          <w:lang w:val="uk-UA"/>
-        </w:rPr>
-      </w:pPr>
-      <w:r>
-        <w:rPr>
-          <w:b/>
-          <w:bCs/>
-          <w:sz w:val="28"/>
-          <w:szCs w:val="28"/>
-          <w:lang w:val="uk-UA"/>
-        </w:rPr>
-        <w:t>Частина ІІ</w:t>
-      </w:r>
-    </w:p>
-    <w:p>
-      <w:pPr>
-        <w:spacing w:after="0"/>
-        <w:rPr>
-          <w:sz w:val="28"/>
-          <w:szCs w:val="28"/>
-          <w:lang w:val="uk-UA"/>
-        </w:rPr>
-      </w:pPr>
-      <w:r>
-        <w:rPr>
-          <w:sz w:val="28"/>
-          <w:szCs w:val="28"/>
-          <w:lang w:val="uk-UA"/>
-        </w:rPr>
-        <w:t>Викона</w:t>
-      </w:r>
-      <w:r>
-        <w:rPr>
-          <w:sz w:val="28"/>
-          <w:szCs w:val="28"/>
-          <w:lang w:val="uk-UA"/>
-        </w:rPr>
-        <w:t>в</w:t>
-      </w:r>
-      <w:r>
-        <w:rPr>
-          <w:sz w:val="28"/>
-          <w:szCs w:val="28"/>
-          <w:lang w:val="uk-UA"/>
-        </w:rPr>
-        <w:t xml:space="preserve"> запити</w:t>
-      </w:r>
-      <w:r>
-        <w:rPr>
-          <w:sz w:val="28"/>
-          <w:szCs w:val="28"/>
-          <w:lang w:val="uk-UA"/>
-        </w:rPr>
-        <w:t>:</w:t>
-      </w:r>
-    </w:p>
-    <w:p>
-      <w:pPr>
-        <w:spacing w:after="0"/>
-        <w:rPr>
-          <w:sz w:val="28"/>
-          <w:szCs w:val="28"/>
-          <w:lang w:val="uk-UA"/>
-        </w:rPr>
-      </w:pPr>
-    </w:p>
-    <w:p>
-      <w:pPr>
-        <w:spacing w:after="0"/>
-        <w:rPr>
-          <w:sz w:val="28"/>
-          <w:szCs w:val="28"/>
-          <w:lang w:val="uk-UA"/>
-        </w:rPr>
-      </w:pPr>
-      <w:r>
-        <w:rPr>
-          <w:sz w:val="28"/>
-          <w:szCs w:val="28"/>
-          <w:lang w:val="uk-UA"/>
-        </w:rPr>
-        <w:t>Запит 8. Вивести на екран з таблиці users покупців жінок зі статусом авторизований</w:t>
-      </w:r>
-      <w:r>
-        <w:rPr>
-          <w:sz w:val="28"/>
-          <w:szCs w:val="28"/>
-          <w:lang w:val="uk-UA"/>
-        </w:rPr>
-        <w:t xml:space="preserve"> </w:t>
-      </w:r>
-      <w:r>
-        <w:rPr>
-          <w:sz w:val="28"/>
-          <w:szCs w:val="28"/>
-          <w:lang w:val="uk-UA"/>
-        </w:rPr>
-        <w:t>покупець.</w:t>
-      </w:r>
-    </w:p>
-    <w:p>
-      <w:pPr>
-        <w:spacing w:after="0"/>
-        <w:rPr>
-          <w:sz w:val="28"/>
-          <w:szCs w:val="28"/>
-          <w:lang w:val="en-US"/>
         </w:rPr>
       </w:pPr>
       <w:r>
@@ -1207,10 +1352,10 @@
           <w:noProof/>
         </w:rPr>
         <w:drawing>
-          <wp:inline distT="0" distB="0" distL="0" distR="0" wp14:anchorId="45EE2705" wp14:editId="2AECF831">
-            <wp:extent cx="6645910" cy="1107440"/>
+          <wp:inline distT="0" distB="0" distL="0" distR="0" wp14:anchorId="4C008057" wp14:editId="7D13993F">
+            <wp:extent cx="6645910" cy="1204595"/>
             <wp:effectExtent l="0" t="0" r="2540" b="0"/>
-            <wp:docPr id="10" name="Рисунок 10"/>
+            <wp:docPr id="16" name="Рисунок 16"/>
             <wp:cNvGraphicFramePr>
               <a:graphicFrameLocks xmlns:a="http://schemas.openxmlformats.org/drawingml/2006/main" noChangeAspect="1"/>
             </wp:cNvGraphicFramePr>
@@ -1230,7 +1375,7 @@
                   <pic:spPr>
                     <a:xfrm>
                       <a:off x="0" y="0"/>
-                      <a:ext cx="6645910" cy="1107440"/>
+                      <a:ext cx="6645910" cy="1204595"/>
                     </a:xfrm>
                     <a:prstGeom prst="rect">
                       <a:avLst/>
@@ -1252,13 +1397,131 @@
           <w:lang w:val="uk-UA"/>
         </w:rPr>
       </w:pPr>
-      <w:r>
-        <w:rPr>
-          <w:sz w:val="28"/>
-          <w:szCs w:val="28"/>
-          <w:lang w:val="uk-UA"/>
-        </w:rPr>
-        <w:t>Запит 9. Вивести на екран з таблиці books книги випущені після 2007р.</w:t>
+    </w:p>
+    <w:p>
+      <w:pPr>
+        <w:spacing w:after="0"/>
+        <w:rPr>
+          <w:b/>
+          <w:bCs/>
+          <w:sz w:val="28"/>
+          <w:szCs w:val="28"/>
+          <w:lang w:val="uk-UA"/>
+        </w:rPr>
+      </w:pPr>
+      <w:r>
+        <w:rPr>
+          <w:b/>
+          <w:bCs/>
+          <w:sz w:val="28"/>
+          <w:szCs w:val="28"/>
+          <w:lang w:val="uk-UA"/>
+        </w:rPr>
+        <w:t>Частина ІІ</w:t>
+      </w:r>
+    </w:p>
+    <w:p>
+      <w:pPr>
+        <w:spacing w:after="0"/>
+        <w:rPr>
+          <w:sz w:val="28"/>
+          <w:szCs w:val="28"/>
+          <w:lang w:val="uk-UA"/>
+        </w:rPr>
+      </w:pPr>
+      <w:r>
+        <w:rPr>
+          <w:sz w:val="28"/>
+          <w:szCs w:val="28"/>
+          <w:lang w:val="uk-UA"/>
+        </w:rPr>
+        <w:t>Викона</w:t>
+      </w:r>
+      <w:r>
+        <w:rPr>
+          <w:sz w:val="28"/>
+          <w:szCs w:val="28"/>
+          <w:lang w:val="uk-UA"/>
+        </w:rPr>
+        <w:t>в</w:t>
+      </w:r>
+      <w:r>
+        <w:rPr>
+          <w:sz w:val="28"/>
+          <w:szCs w:val="28"/>
+          <w:lang w:val="uk-UA"/>
+        </w:rPr>
+        <w:t xml:space="preserve"> запити</w:t>
+      </w:r>
+      <w:r>
+        <w:rPr>
+          <w:sz w:val="28"/>
+          <w:szCs w:val="28"/>
+          <w:lang w:val="uk-UA"/>
+        </w:rPr>
+        <w:t>:</w:t>
+      </w:r>
+    </w:p>
+    <w:p>
+      <w:pPr>
+        <w:spacing w:after="0"/>
+        <w:rPr>
+          <w:sz w:val="28"/>
+          <w:szCs w:val="28"/>
+          <w:lang w:val="uk-UA"/>
+        </w:rPr>
+      </w:pPr>
+    </w:p>
+    <w:p>
+      <w:pPr>
+        <w:spacing w:after="0"/>
+        <w:rPr>
+          <w:sz w:val="28"/>
+          <w:szCs w:val="28"/>
+          <w:lang w:val="uk-UA"/>
+        </w:rPr>
+      </w:pPr>
+      <w:r>
+        <w:rPr>
+          <w:sz w:val="28"/>
+          <w:szCs w:val="28"/>
+          <w:lang w:val="uk-UA"/>
+        </w:rPr>
+        <w:t xml:space="preserve">Запит 8. Вивести на екран з таблиці </w:t>
+      </w:r>
+      <w:proofErr w:type="spellStart"/>
+      <w:r>
+        <w:rPr>
+          <w:sz w:val="28"/>
+          <w:szCs w:val="28"/>
+          <w:lang w:val="uk-UA"/>
+        </w:rPr>
+        <w:t>users</w:t>
+      </w:r>
+      <w:proofErr w:type="spellEnd"/>
+      <w:r>
+        <w:rPr>
+          <w:sz w:val="28"/>
+          <w:szCs w:val="28"/>
+          <w:lang w:val="uk-UA"/>
+        </w:rPr>
+        <w:t xml:space="preserve"> покупців жінок зі статусом авторизований</w:t>
+      </w:r>
+      <w:r>
+        <w:rPr>
+          <w:sz w:val="28"/>
+          <w:szCs w:val="28"/>
+          <w:lang w:val="uk-UA"/>
+        </w:rPr>
+        <w:t xml:space="preserve"> </w:t>
+      </w:r>
+      <w:r>
+        <w:rPr>
+          <w:sz w:val="28"/>
+          <w:szCs w:val="28"/>
+          <w:lang w:val="uk-UA"/>
+        </w:rPr>
+        <w:t>покупець.</w:t>
       </w:r>
     </w:p>
     <w:p>
@@ -1275,10 +1538,10 @@
           <w:noProof/>
         </w:rPr>
         <w:drawing>
-          <wp:inline distT="0" distB="0" distL="0" distR="0" wp14:anchorId="1965125F" wp14:editId="55FDDEB4">
-            <wp:extent cx="6645910" cy="1431925"/>
+          <wp:inline distT="0" distB="0" distL="0" distR="0" wp14:anchorId="45EE2705" wp14:editId="2AECF831">
+            <wp:extent cx="6645910" cy="1107440"/>
             <wp:effectExtent l="0" t="0" r="2540" b="0"/>
-            <wp:docPr id="11" name="Рисунок 11"/>
+            <wp:docPr id="10" name="Рисунок 10"/>
             <wp:cNvGraphicFramePr>
               <a:graphicFrameLocks xmlns:a="http://schemas.openxmlformats.org/drawingml/2006/main" noChangeAspect="1"/>
             </wp:cNvGraphicFramePr>
@@ -1298,7 +1561,7 @@
                   <pic:spPr>
                     <a:xfrm>
                       <a:off x="0" y="0"/>
-                      <a:ext cx="6645910" cy="1431925"/>
+                      <a:ext cx="6645910" cy="1107440"/>
                     </a:xfrm>
                     <a:prstGeom prst="rect">
                       <a:avLst/>
@@ -1326,28 +1589,46 @@
           <w:szCs w:val="28"/>
           <w:lang w:val="uk-UA"/>
         </w:rPr>
+        <w:t xml:space="preserve">Запит 9. Вивести на екран з таблиці </w:t>
+      </w:r>
+      <w:proofErr w:type="spellStart"/>
+      <w:r>
+        <w:rPr>
+          <w:sz w:val="28"/>
+          <w:szCs w:val="28"/>
+          <w:lang w:val="uk-UA"/>
+        </w:rPr>
+        <w:t>books</w:t>
+      </w:r>
+      <w:proofErr w:type="spellEnd"/>
+      <w:r>
+        <w:rPr>
+          <w:sz w:val="28"/>
+          <w:szCs w:val="28"/>
+          <w:lang w:val="uk-UA"/>
+        </w:rPr>
+        <w:t xml:space="preserve"> книги випущені після 2007р.</w:t>
+      </w:r>
+    </w:p>
+    <w:p>
+      <w:pPr>
+        <w:spacing w:after="0"/>
+        <w:rPr>
+          <w:sz w:val="28"/>
+          <w:szCs w:val="28"/>
+          <w:lang w:val="en-US"/>
+        </w:rPr>
+      </w:pPr>
+      <w:r>
+        <w:rPr>
+          <w:noProof/>
+        </w:rPr>
         <w:lastRenderedPageBreak/>
-        <w:t>Запит 10. Вивести на екран з таблиці books книги ціна яких в межах 250-400грн</w:t>
-      </w:r>
-    </w:p>
-    <w:p>
-      <w:pPr>
-        <w:spacing w:after="0"/>
-        <w:rPr>
-          <w:sz w:val="28"/>
-          <w:szCs w:val="28"/>
-          <w:lang w:val="uk-UA"/>
-        </w:rPr>
-      </w:pPr>
-      <w:r>
-        <w:rPr>
-          <w:noProof/>
-        </w:rPr>
         <w:drawing>
-          <wp:inline distT="0" distB="0" distL="0" distR="0" wp14:anchorId="310470C0" wp14:editId="3077610D">
-            <wp:extent cx="6645910" cy="1196975"/>
-            <wp:effectExtent l="0" t="0" r="2540" b="3175"/>
-            <wp:docPr id="12" name="Рисунок 12"/>
+          <wp:inline distT="0" distB="0" distL="0" distR="0" wp14:anchorId="1965125F" wp14:editId="55FDDEB4">
+            <wp:extent cx="6645910" cy="1431925"/>
+            <wp:effectExtent l="0" t="0" r="2540" b="0"/>
+            <wp:docPr id="11" name="Рисунок 11"/>
             <wp:cNvGraphicFramePr>
               <a:graphicFrameLocks xmlns:a="http://schemas.openxmlformats.org/drawingml/2006/main" noChangeAspect="1"/>
             </wp:cNvGraphicFramePr>
@@ -1367,7 +1648,7 @@
                   <pic:spPr>
                     <a:xfrm>
                       <a:off x="0" y="0"/>
-                      <a:ext cx="6645910" cy="1196975"/>
+                      <a:ext cx="6645910" cy="1431925"/>
                     </a:xfrm>
                     <a:prstGeom prst="rect">
                       <a:avLst/>
@@ -1386,24 +1667,34 @@
         <w:rPr>
           <w:sz w:val="28"/>
           <w:szCs w:val="28"/>
-          <w:lang w:val="en-US"/>
-        </w:rPr>
-      </w:pPr>
-      <w:r>
-        <w:rPr>
-          <w:sz w:val="28"/>
-          <w:szCs w:val="28"/>
-          <w:lang w:val="uk-UA"/>
-        </w:rPr>
-        <w:t>Запит 11. Вивести на екран з таблиці books назви книг які починаються з літери «D</w:t>
-      </w:r>
-      <w:r>
-        <w:rPr>
-          <w:sz w:val="28"/>
-          <w:szCs w:val="28"/>
-          <w:lang w:val="uk-UA"/>
-        </w:rPr>
-        <w:t>»</w:t>
+          <w:lang w:val="uk-UA"/>
+        </w:rPr>
+      </w:pPr>
+      <w:r>
+        <w:rPr>
+          <w:sz w:val="28"/>
+          <w:szCs w:val="28"/>
+          <w:lang w:val="uk-UA"/>
+        </w:rPr>
+        <w:t xml:space="preserve">Запит 10. Вивести на екран з таблиці </w:t>
+      </w:r>
+      <w:proofErr w:type="spellStart"/>
+      <w:r>
+        <w:rPr>
+          <w:sz w:val="28"/>
+          <w:szCs w:val="28"/>
+          <w:lang w:val="uk-UA"/>
+        </w:rPr>
+        <w:t>books</w:t>
+      </w:r>
+      <w:proofErr w:type="spellEnd"/>
+      <w:r>
+        <w:rPr>
+          <w:sz w:val="28"/>
+          <w:szCs w:val="28"/>
+          <w:lang w:val="uk-UA"/>
+        </w:rPr>
+        <w:t xml:space="preserve"> книги ціна яких в межах 250-400грн</w:t>
       </w:r>
     </w:p>
     <w:p>
@@ -1420,10 +1711,10 @@
           <w:noProof/>
         </w:rPr>
         <w:drawing>
-          <wp:inline distT="0" distB="0" distL="0" distR="0" wp14:anchorId="054A45A7" wp14:editId="0D5ECFDE">
-            <wp:extent cx="4600575" cy="1304925"/>
-            <wp:effectExtent l="0" t="0" r="9525" b="9525"/>
-            <wp:docPr id="13" name="Рисунок 13"/>
+          <wp:inline distT="0" distB="0" distL="0" distR="0" wp14:anchorId="310470C0" wp14:editId="3077610D">
+            <wp:extent cx="6645910" cy="1196975"/>
+            <wp:effectExtent l="0" t="0" r="2540" b="3175"/>
+            <wp:docPr id="12" name="Рисунок 12"/>
             <wp:cNvGraphicFramePr>
               <a:graphicFrameLocks xmlns:a="http://schemas.openxmlformats.org/drawingml/2006/main" noChangeAspect="1"/>
             </wp:cNvGraphicFramePr>
@@ -1443,7 +1734,7 @@
                   <pic:spPr>
                     <a:xfrm>
                       <a:off x="0" y="0"/>
-                      <a:ext cx="4600575" cy="1304925"/>
+                      <a:ext cx="6645910" cy="1196975"/>
                     </a:xfrm>
                     <a:prstGeom prst="rect">
                       <a:avLst/>
@@ -1462,56 +1753,50 @@
         <w:rPr>
           <w:sz w:val="28"/>
           <w:szCs w:val="28"/>
-          <w:lang w:val="uk-UA"/>
-        </w:rPr>
-      </w:pPr>
-      <w:r>
-        <w:rPr>
-          <w:sz w:val="28"/>
-          <w:szCs w:val="28"/>
-          <w:lang w:val="uk-UA"/>
-        </w:rPr>
-        <w:t>Запит 12. Створити простий запит на вибірку до таблиці books, який виводить</w:t>
-      </w:r>
-      <w:r>
-        <w:rPr>
-          <w:sz w:val="28"/>
-          <w:szCs w:val="28"/>
-          <w:lang w:val="uk-UA"/>
-        </w:rPr>
-        <w:t xml:space="preserve"> </w:t>
-      </w:r>
-      <w:r>
-        <w:rPr>
-          <w:sz w:val="28"/>
-          <w:szCs w:val="28"/>
-          <w:lang w:val="uk-UA"/>
-        </w:rPr>
-        <w:t>максимальну і мінімальну ціни товарних позицій, привласнюючи їм відповідно</w:t>
-      </w:r>
-      <w:r>
-        <w:rPr>
-          <w:sz w:val="28"/>
-          <w:szCs w:val="28"/>
-          <w:lang w:val="uk-UA"/>
-        </w:rPr>
-        <w:t xml:space="preserve"> </w:t>
-      </w:r>
-      <w:r>
-        <w:rPr>
-          <w:sz w:val="28"/>
-          <w:szCs w:val="28"/>
-          <w:lang w:val="uk-UA"/>
-        </w:rPr>
-        <w:t>псевдоніми maximum і minimum.</w:t>
-      </w:r>
-    </w:p>
-    <w:p>
-      <w:pPr>
-        <w:spacing w:after="0"/>
-        <w:rPr>
-          <w:sz w:val="28"/>
-          <w:szCs w:val="28"/>
+        </w:rPr>
+      </w:pPr>
+      <w:r>
+        <w:rPr>
+          <w:sz w:val="28"/>
+          <w:szCs w:val="28"/>
+          <w:lang w:val="uk-UA"/>
+        </w:rPr>
+        <w:t xml:space="preserve">Запит 11. Вивести на екран з таблиці </w:t>
+      </w:r>
+      <w:proofErr w:type="spellStart"/>
+      <w:r>
+        <w:rPr>
+          <w:sz w:val="28"/>
+          <w:szCs w:val="28"/>
+          <w:lang w:val="uk-UA"/>
+        </w:rPr>
+        <w:t>books</w:t>
+      </w:r>
+      <w:proofErr w:type="spellEnd"/>
+      <w:r>
+        <w:rPr>
+          <w:sz w:val="28"/>
+          <w:szCs w:val="28"/>
+          <w:lang w:val="uk-UA"/>
+        </w:rPr>
+        <w:t xml:space="preserve"> назви книг які починаються з літери «D</w:t>
+      </w:r>
+      <w:r>
+        <w:rPr>
+          <w:sz w:val="28"/>
+          <w:szCs w:val="28"/>
+          <w:lang w:val="uk-UA"/>
+        </w:rPr>
+        <w:t>»</w:t>
+      </w:r>
+    </w:p>
+    <w:p>
+      <w:pPr>
+        <w:spacing w:after="0"/>
+        <w:rPr>
+          <w:sz w:val="28"/>
+          <w:szCs w:val="28"/>
+          <w:lang w:val="uk-UA"/>
         </w:rPr>
       </w:pPr>
       <w:r>
@@ -1519,10 +1804,10 @@
           <w:noProof/>
         </w:rPr>
         <w:drawing>
-          <wp:inline distT="0" distB="0" distL="0" distR="0" wp14:anchorId="6BC94BF4" wp14:editId="2473CFB2">
-            <wp:extent cx="5753100" cy="1181100"/>
-            <wp:effectExtent l="0" t="0" r="0" b="0"/>
-            <wp:docPr id="14" name="Рисунок 14"/>
+          <wp:inline distT="0" distB="0" distL="0" distR="0" wp14:anchorId="054A45A7" wp14:editId="0D5ECFDE">
+            <wp:extent cx="4600575" cy="1304925"/>
+            <wp:effectExtent l="0" t="0" r="9525" b="9525"/>
+            <wp:docPr id="13" name="Рисунок 13"/>
             <wp:cNvGraphicFramePr>
               <a:graphicFrameLocks xmlns:a="http://schemas.openxmlformats.org/drawingml/2006/main" noChangeAspect="1"/>
             </wp:cNvGraphicFramePr>
@@ -1542,6 +1827,159 @@
                   <pic:spPr>
                     <a:xfrm>
                       <a:off x="0" y="0"/>
+                      <a:ext cx="4600575" cy="1304925"/>
+                    </a:xfrm>
+                    <a:prstGeom prst="rect">
+                      <a:avLst/>
+                    </a:prstGeom>
+                  </pic:spPr>
+                </pic:pic>
+              </a:graphicData>
+            </a:graphic>
+          </wp:inline>
+        </w:drawing>
+      </w:r>
+    </w:p>
+    <w:p>
+      <w:pPr>
+        <w:spacing w:after="0"/>
+        <w:rPr>
+          <w:sz w:val="28"/>
+          <w:szCs w:val="28"/>
+          <w:lang w:val="uk-UA"/>
+        </w:rPr>
+      </w:pPr>
+      <w:r>
+        <w:rPr>
+          <w:sz w:val="28"/>
+          <w:szCs w:val="28"/>
+          <w:lang w:val="uk-UA"/>
+        </w:rPr>
+        <w:t xml:space="preserve">Запит 12. Створити простий запит на вибірку до таблиці </w:t>
+      </w:r>
+      <w:proofErr w:type="spellStart"/>
+      <w:r>
+        <w:rPr>
+          <w:sz w:val="28"/>
+          <w:szCs w:val="28"/>
+          <w:lang w:val="uk-UA"/>
+        </w:rPr>
+        <w:t>books</w:t>
+      </w:r>
+      <w:proofErr w:type="spellEnd"/>
+      <w:r>
+        <w:rPr>
+          <w:sz w:val="28"/>
+          <w:szCs w:val="28"/>
+          <w:lang w:val="uk-UA"/>
+        </w:rPr>
+        <w:t>, який виводить</w:t>
+      </w:r>
+      <w:r>
+        <w:rPr>
+          <w:sz w:val="28"/>
+          <w:szCs w:val="28"/>
+          <w:lang w:val="uk-UA"/>
+        </w:rPr>
+        <w:t xml:space="preserve"> </w:t>
+      </w:r>
+      <w:r>
+        <w:rPr>
+          <w:sz w:val="28"/>
+          <w:szCs w:val="28"/>
+          <w:lang w:val="uk-UA"/>
+        </w:rPr>
+        <w:t>максимальну і мінімальну ціни товарних позицій, привласнюючи їм відповідно</w:t>
+      </w:r>
+      <w:r>
+        <w:rPr>
+          <w:sz w:val="28"/>
+          <w:szCs w:val="28"/>
+          <w:lang w:val="uk-UA"/>
+        </w:rPr>
+        <w:t xml:space="preserve"> </w:t>
+      </w:r>
+      <w:r>
+        <w:rPr>
+          <w:sz w:val="28"/>
+          <w:szCs w:val="28"/>
+          <w:lang w:val="uk-UA"/>
+        </w:rPr>
+        <w:t xml:space="preserve">псевдоніми </w:t>
+      </w:r>
+      <w:proofErr w:type="spellStart"/>
+      <w:r>
+        <w:rPr>
+          <w:sz w:val="28"/>
+          <w:szCs w:val="28"/>
+          <w:lang w:val="uk-UA"/>
+        </w:rPr>
+        <w:t>maximum</w:t>
+      </w:r>
+      <w:proofErr w:type="spellEnd"/>
+      <w:r>
+        <w:rPr>
+          <w:sz w:val="28"/>
+          <w:szCs w:val="28"/>
+          <w:lang w:val="uk-UA"/>
+        </w:rPr>
+        <w:t xml:space="preserve"> і </w:t>
+      </w:r>
+      <w:proofErr w:type="spellStart"/>
+      <w:r>
+        <w:rPr>
+          <w:sz w:val="28"/>
+          <w:szCs w:val="28"/>
+          <w:lang w:val="uk-UA"/>
+        </w:rPr>
+        <w:t>minimum</w:t>
+      </w:r>
+      <w:proofErr w:type="spellEnd"/>
+      <w:r>
+        <w:rPr>
+          <w:sz w:val="28"/>
+          <w:szCs w:val="28"/>
+          <w:lang w:val="uk-UA"/>
+        </w:rPr>
+        <w:t>.</w:t>
+      </w:r>
+    </w:p>
+    <w:p>
+      <w:pPr>
+        <w:spacing w:after="0"/>
+        <w:rPr>
+          <w:sz w:val="28"/>
+          <w:szCs w:val="28"/>
+        </w:rPr>
+      </w:pPr>
+      <w:r>
+        <w:rPr>
+          <w:noProof/>
+        </w:rPr>
+        <w:drawing>
+          <wp:inline distT="0" distB="0" distL="0" distR="0" wp14:anchorId="6BC94BF4" wp14:editId="2473CFB2">
+            <wp:extent cx="5753100" cy="1181100"/>
+            <wp:effectExtent l="0" t="0" r="0" b="0"/>
+            <wp:docPr id="14" name="Рисунок 14"/>
+            <wp:cNvGraphicFramePr>
+              <a:graphicFrameLocks xmlns:a="http://schemas.openxmlformats.org/drawingml/2006/main" noChangeAspect="1"/>
+            </wp:cNvGraphicFramePr>
+            <a:graphic xmlns:a="http://schemas.openxmlformats.org/drawingml/2006/main">
+              <a:graphicData uri="http://schemas.openxmlformats.org/drawingml/2006/picture">
+                <pic:pic xmlns:pic="http://schemas.openxmlformats.org/drawingml/2006/picture">
+                  <pic:nvPicPr>
+                    <pic:cNvPr id="1" name=""/>
+                    <pic:cNvPicPr/>
+                  </pic:nvPicPr>
+                  <pic:blipFill>
+                    <a:blip r:embed="rId18"/>
+                    <a:stretch>
+                      <a:fillRect/>
+                    </a:stretch>
+                  </pic:blipFill>
+                  <pic:spPr>
+                    <a:xfrm>
+                      <a:off x="0" y="0"/>
                       <a:ext cx="5753100" cy="1181100"/>
                     </a:xfrm>
                     <a:prstGeom prst="rect">
@@ -1592,7 +2030,25 @@
           <w:szCs w:val="28"/>
           <w:lang w:val="uk-UA"/>
         </w:rPr>
-        <w:t>1. Ключове слово having. Коли і як потрібно його використовувати.</w:t>
+        <w:t xml:space="preserve">1. Ключове слово </w:t>
+      </w:r>
+      <w:proofErr w:type="spellStart"/>
+      <w:r>
+        <w:rPr>
+          <w:sz w:val="28"/>
+          <w:szCs w:val="28"/>
+          <w:lang w:val="uk-UA"/>
+        </w:rPr>
+        <w:t>having</w:t>
+      </w:r>
+      <w:proofErr w:type="spellEnd"/>
+      <w:r>
+        <w:rPr>
+          <w:sz w:val="28"/>
+          <w:szCs w:val="28"/>
+          <w:lang w:val="uk-UA"/>
+        </w:rPr>
+        <w:t>. Коли і як потрібно його використовувати.</w:t>
       </w:r>
     </w:p>
     <w:p>
@@ -1704,13 +2160,23 @@
         </w:rPr>
         <w:t xml:space="preserve"> </w:t>
       </w:r>
-      <w:r>
-        <w:rPr>
-          <w:sz w:val="28"/>
-          <w:szCs w:val="28"/>
-          <w:lang w:val="uk-UA"/>
-        </w:rPr>
-        <w:t>MySQL.</w:t>
+      <w:proofErr w:type="spellStart"/>
+      <w:r>
+        <w:rPr>
+          <w:sz w:val="28"/>
+          <w:szCs w:val="28"/>
+          <w:lang w:val="uk-UA"/>
+        </w:rPr>
+        <w:t>MySQL</w:t>
+      </w:r>
+      <w:proofErr w:type="spellEnd"/>
+      <w:r>
+        <w:rPr>
+          <w:sz w:val="28"/>
+          <w:szCs w:val="28"/>
+          <w:lang w:val="uk-UA"/>
+        </w:rPr>
+        <w:t>.</w:t>
       </w:r>
     </w:p>
     <w:p>

</xml_diff>